<commit_message>
Fix cards welding themselves over the app for five minutes
card() draws the card, runs the transition underneath it, then draws
again -- because a navigation destroys the first card along with the
document. A tab click destroys nothing, so from section 06 on, where
every transition is a tab click, the second draw appended a second
element with the same id. CARD_REMOVE_JS used getElementById, which
removes one of them. The other stayed on top of the Streamlit app for
the rest of the recording: the last five minutes were title cards back
to back with the app running invisibly underneath.

CARD_JS now clears any existing card before drawing, and the removal
uses querySelectorAll. card() asserts the screen is actually clear
afterwards -- the recording ran to completion and wrote a plausible
file, so nothing but watching all seven minutes would have caught it.

Co-Authored-By: Claude Opus 5 <noreply@anthropic.com>
</commit_message>
<xml_diff>
--- a/docs/demo_script.docx
+++ b/docs/demo_script.docx
@@ -23,7 +23,7 @@
         <w:t>docs/demo_titled.mp4</w:t>
       </w:r>
       <w:r>
-        <w:t xml:space="preserve"> — 6 min 57 s. Roughly 730 words, which is a relaxed pace with pauses left in. Timecodes are where each card appears, so you have a moment of dark screen to start each line on.</w:t>
+        <w:t xml:space="preserve"> — 6 min 24 s. Roughly 730 words, which is a relaxed pace with pauses left in. Timecodes are where each card appears, so you have a moment of dark screen to start each line on.</w:t>
       </w:r>
     </w:p>
     <w:p>
@@ -110,7 +110,7 @@
         <w:pStyle w:val="Heading3"/>
       </w:pPr>
       <w:r>
-        <w:t>0:47 — Which models, and why</w:t>
+        <w:t>0:48 — Which models, and why</w:t>
       </w:r>
     </w:p>
     <w:p>
@@ -123,7 +123,7 @@
         <w:pStyle w:val="Heading3"/>
       </w:pPr>
       <w:r>
-        <w:t>1:06 — Is it healthy?</w:t>
+        <w:t>1:07 — Is it healthy?</w:t>
       </w:r>
     </w:p>
     <w:p>
@@ -136,7 +136,7 @@
         <w:pStyle w:val="Heading3"/>
       </w:pPr>
       <w:r>
-        <w:t>1:19 — The app</w:t>
+        <w:t>1:20 — The app</w:t>
       </w:r>
     </w:p>
     <w:p>
@@ -149,7 +149,7 @@
         <w:pStyle w:val="Heading3"/>
       </w:pPr>
       <w:r>
-        <w:t>1:42 — Reading the resume</w:t>
+        <w:t>1:40 — Reading the resume</w:t>
       </w:r>
     </w:p>
     <w:p>
@@ -177,7 +177,7 @@
         <w:pStyle w:val="Heading3"/>
       </w:pPr>
       <w:r>
-        <w:t>2:28 — Pulling out the facts</w:t>
+        <w:t>2:16 — Pulling out the facts</w:t>
       </w:r>
     </w:p>
     <w:p>
@@ -195,7 +195,7 @@
         <w:pStyle w:val="Heading3"/>
       </w:pPr>
       <w:r>
-        <w:t>2:54 — Scoring the fit</w:t>
+        <w:t>2:37 — Scoring the fit</w:t>
       </w:r>
     </w:p>
     <w:p>
@@ -213,7 +213,7 @@
         <w:pStyle w:val="Heading3"/>
       </w:pPr>
       <w:r>
-        <w:t>3:17 — Small model vs large model</w:t>
+        <w:t>2:57 — Small model vs large model</w:t>
       </w:r>
     </w:p>
     <w:p>
@@ -246,7 +246,7 @@
         <w:pStyle w:val="Heading3"/>
       </w:pPr>
       <w:r>
-        <w:t>3:55 — Asking questions</w:t>
+        <w:t>3:30 — Asking questions</w:t>
       </w:r>
     </w:p>
     <w:p>
@@ -274,7 +274,7 @@
         <w:pStyle w:val="Heading3"/>
       </w:pPr>
       <w:r>
-        <w:t>4:41 — Writing the brief</w:t>
+        <w:t>4:10 — Writing the brief</w:t>
       </w:r>
     </w:p>
     <w:p>
@@ -297,7 +297,7 @@
         <w:pStyle w:val="Heading3"/>
       </w:pPr>
       <w:r>
-        <w:t>5:21 — All of it, in one call</w:t>
+        <w:t>4:48 — All of it, in one call</w:t>
       </w:r>
     </w:p>
     <w:p>
@@ -315,7 +315,7 @@
         <w:pStyle w:val="Heading3"/>
       </w:pPr>
       <w:r>
-        <w:t>6:08 — Watching it in production</w:t>
+        <w:t>5:38 — Watching it in production</w:t>
       </w:r>
     </w:p>
     <w:p>

</xml_diff>